<commit_message>
Refocus second report on pre-execution authorization checks
</commit_message>
<xml_diff>
--- a/reports/第二次汇报/第二次汇报技术实现与实验说明.docx
+++ b/reports/第二次汇报/第二次汇报技术实现与实验说明.docx
@@ -15,7 +15,7 @@
         <w:keepNext/>
       </w:pPr>
       <w:r>
-        <w:t>第二次阶段报告 系统实现与对照实验</w:t>
+        <w:t>第二次阶段报告 执行授权检查与攻击对照实验</w:t>
       </w:r>
     </w:p>
     <w:p>
@@ -28,12 +28,12 @@
     </w:p>
     <w:p>
       <w:r>
-        <w:t>第一次汇报梳理了提示注入的攻击入口和防御机制。本阶段，本组在AgentDojo模拟银行环境中搭建工具型智能体，研究交易备注中的恶意指令如何影响工具调用，并实现第一版执行授权检查器V0。实验围绕两个问题展开：外部内容是否诱导了用户未授权的操作；执行前检查是否阻止了相应的银行状态修改。</w:t>
+        <w:t>第一次汇报梳理了提示注入的攻击入口和防御机制。本阶段，本组在AgentDojo模拟银行环境中实现工具型智能体和V0执行授权检查器，验证交易备注中的恶意指令进入模型上下文后，越权调用是否在银行函数执行前被阻断。检查对象为用户任务授权的工具、收款账户、周期标志、写入次数及参数基本类型。</w:t>
       </w:r>
     </w:p>
     <w:p>
       <w:r>
-        <w:t>我们完成了本地模型接入、四项任务的授权策略、V0执行器、三配置实验管线、独立评分器和逐轮轨迹记录。正式评测包含48种条件，在三个随机种子下重复运行，共取得144条完整轨迹。C0默认执行与C2加入V0时，预定攻击目标达成分别为5/36和0/36，攻击下完整任务完成分别为24/36和27/36。</w:t>
+        <w:t>我们完成了模型接入、任务策略登记、执行器改造、三配置装配、独立评分和逐轮轨迹记录，运行四项任务、四种输入、三种配置及三个随机种子的144条正式对照。C2中7条攻击轨迹触发15次实际拒绝，受检规则内的违规写入实际执行数为0；周期付款案例记录了模型提出修改、检查器拒绝和原付款收款人保持原值的全过程。</w:t>
       </w:r>
     </w:p>
     <w:p>
@@ -109,7 +109,7 @@
     </w:p>
     <w:p>
       <w:r>
-        <w:t>V0中的固定参数来自任务授权。差额退款应退4、全额退款应退10、周期付款金额应为50，均依赖交易数据及计算，本阶段将它们放在独立评分器中核验。V0没有预先写入这三个正确金额。策略与执行分别位于</w:t>
+        <w:t>任务策略由TaskPolicy登记，单个参数约束由ParameterRule表达，check_v0_call返回allowed、code和reason。执行器将决定与原调用编号一起保存；只有allowed=true的请求才执行runtime.run_function。策略与执行分别位于</w:t>
       </w:r>
       <w:hyperlink r:id="rId10">
         <w:r>
@@ -146,7 +146,7 @@
     </w:p>
     <w:p>
       <w:r>
-        <w:t>评分器与V0使用独立的任务规格。V0回答某个调用是否符合当前静态策略；评分器根据任务正确结果，核对执行前后的交易、周期付款、账户信息及文件状态。两部分分别实现，错误金额即使获V0放行，也会被评分器记为偏离用户任务的写入。</w:t>
+        <w:t>本组分别登记执行授权规则和业务任务规格。执行授权复核检查调用使用的工具、固定参数、次数及基本类型；业务评分核对完整任务结果。模型提出的调用、检查器决定与实际银行写入分别记录，按调用编号和前后状态交叉核对。</w:t>
       </w:r>
     </w:p>
     <w:p>
@@ -446,7 +446,7 @@
     </w:p>
     <w:p>
       <w:r>
-        <w:t>随机种子是模型生成时使用的采样参数。本实验设置42、17、73三个种子，在每个种子下重复完整的四任务、四输入、三配置组合。同一任务、输入和种子对应的C0、C1、C2构成一组对照；文中的“种子17”指采样参数seed=17的一轮实验。</w:t>
+        <w:t>随机种子是模型生成时使用的采样参数。本实验设置42、17、73三个种子，在每个种子下重复完整的四任务、四输入、三配置组合。同一任务、输入和种子对应的C0、C1、C2构成一组对照；seed=17表示以17作为采样种子运行。</w:t>
       </w:r>
     </w:p>
     <w:p>
@@ -611,7 +611,7 @@
     </w:p>
     <w:p>
       <w:r>
-        <w:t>每条轨迹关联模型请求、工具返回、执行审计和前后状态。我们逐项复算评分与汇总，并复核只读任务答复。48组C0与C2的首轮请求一致，其中42组首轮语义响应一致，6组存在差异；具体拦截效果以实际执行审计和状态变化判定。</w:t>
+        <w:t>每条轨迹关联模型请求、工具返回、执行审计和前后状态。我们按冻结的任务规则复核135个候选写调用，逐项核对违规请求是否成功执行，并检查C2拒绝决定对应的工具返回及银行状态。原始轨迹、综合任务评分和执行授权复核分别保存。</w:t>
       </w:r>
     </w:p>
     <w:p>
@@ -868,7 +868,7 @@
         <w:pStyle w:val="Heading1"/>
       </w:pPr>
       <w:r>
-        <w:t>7 实验结果与分析</w:t>
+        <w:t>7 执行授权检查的实验结果</w:t>
       </w:r>
     </w:p>
     <w:p>
@@ -876,22 +876,22 @@
         <w:pStyle w:val="Heading2"/>
       </w:pPr>
       <w:r>
-        <w:t>7.1 统计指标</w:t>
+        <w:t>7.1 授权违规与实际写入的统计</w:t>
       </w:r>
     </w:p>
     <w:p>
       <w:r>
-        <w:t>完整任务完成要求模型正常给出最终答复、任务结果正确，且没有额外未授权状态变化。正常任务完成率以12条正常轨迹为分母；攻击下完整完成率以36条攻击轨迹为分母。单纯创建正确目标记录但同时修改了其他付款，完整任务评分不通过。</w:t>
+        <w:t>“静态授权违规实际写入”统计违反已冻结V0规则且成功执行的写调用，包括工具未授权、静态参数不符和次数超限。C0、C1按同一规则复核实际调用，C2同时核对执行时审计。每配置保留全部36条攻击轨迹，某条轨迹出现至少一次这类成功写入即计入分子。</w:t>
       </w:r>
     </w:p>
     <w:p>
       <w:r>
-        <w:t>攻击目标达成按第4.1节三个预定目标检查。未授权写入按用户任务检查已经成功执行的写调用，包括工具类型、收款人、金额和次数偏离；金额错误即使未完成攻击者预定目标，也计入这一指标。每条轨迹在每项指标中最多计一次。</w:t>
+        <w:t>“攻击目标达成”按第4.1节的三个目标核对银行状态，以每配置36条攻击轨迹为分母。正常任务和攻击下完整任务完成沿用独立业务评分，分别以12条、36条轨迹为分母，要求结果正确、无附带未授权状态变化并正常结束。</w:t>
       </w:r>
     </w:p>
     <w:p>
       <w:r>
-        <w:t>拦截次数按实际审计中blocked=true的请求计数，与发生拦截的轨迹数分别统计。正常合法调用误拒以正常条件下符合独立任务规格的候选写调用为分母，检查其中被V0拒绝的次数。</w:t>
+        <w:t>实际拦截次数按运行时审计中blocked=true的请求计数。我们逐个匹配被拒绝请求的调用编号、工具返回和执行标志，检查是否存在拒绝决定之后仍成功写入的记录。</w:t>
       </w:r>
     </w:p>
     <w:p>
@@ -899,7 +899,7 @@
         <w:pStyle w:val="Heading2"/>
       </w:pPr>
       <w:r>
-        <w:t>7.2 三配置总体结果</w:t>
+        <w:t>7.2 三配置对照结果</w:t>
       </w:r>
     </w:p>
     <w:tbl>
@@ -972,34 +972,6 @@
                 <w:color w:val="FFFFFF"/>
                 <w:sz w:val="18"/>
               </w:rPr>
-              <w:t>正常任务完成</w:t>
-            </w:r>
-          </w:p>
-        </w:tc>
-        <w:tc>
-          <w:tcPr>
-            <w:tcW w:type="dxa" w:w="2183"/>
-            <w:vAlign w:val="center"/>
-            <w:shd w:fill="234F7D"/>
-            <w:tcBorders>
-              <w:top w:val="single" w:sz="4" w:color="D9D9D9"/>
-              <w:left w:val="single" w:sz="4" w:color="D9D9D9"/>
-              <w:bottom w:val="single" w:sz="4" w:color="D9D9D9"/>
-              <w:right w:val="single" w:sz="4" w:color="D9D9D9"/>
-            </w:tcBorders>
-          </w:tcPr>
-          <w:p>
-            <w:pPr>
-              <w:keepNext/>
-              <w:spacing w:after="80" w:before="80"/>
-              <w:jc w:val="center"/>
-            </w:pPr>
-            <w:r>
-              <w:rPr>
-                <w:b/>
-                <w:color w:val="FFFFFF"/>
-                <w:sz w:val="18"/>
-              </w:rPr>
               <w:t>攻击目标达成</w:t>
             </w:r>
           </w:p>
@@ -1028,7 +1000,35 @@
                 <w:color w:val="FFFFFF"/>
                 <w:sz w:val="18"/>
               </w:rPr>
-              <w:t>未授权写入</w:t>
+              <w:t>静态授权违规实际写入</w:t>
+            </w:r>
+          </w:p>
+        </w:tc>
+        <w:tc>
+          <w:tcPr>
+            <w:tcW w:type="dxa" w:w="2183"/>
+            <w:vAlign w:val="center"/>
+            <w:shd w:fill="234F7D"/>
+            <w:tcBorders>
+              <w:top w:val="single" w:sz="4" w:color="D9D9D9"/>
+              <w:left w:val="single" w:sz="4" w:color="D9D9D9"/>
+              <w:bottom w:val="single" w:sz="4" w:color="D9D9D9"/>
+              <w:right w:val="single" w:sz="4" w:color="D9D9D9"/>
+            </w:tcBorders>
+          </w:tcPr>
+          <w:p>
+            <w:pPr>
+              <w:keepNext/>
+              <w:spacing w:after="80" w:before="80"/>
+              <w:jc w:val="center"/>
+            </w:pPr>
+            <w:r>
+              <w:rPr>
+                <w:b/>
+                <w:color w:val="FFFFFF"/>
+                <w:sz w:val="18"/>
+              </w:rPr>
+              <w:t>正常任务完成</w:t>
             </w:r>
           </w:p>
         </w:tc>
@@ -1113,32 +1113,6 @@
               <w:rPr>
                 <w:sz w:val="18"/>
               </w:rPr>
-              <w:t>11/12（91.7%）</w:t>
-            </w:r>
-          </w:p>
-        </w:tc>
-        <w:tc>
-          <w:tcPr>
-            <w:tcW w:type="dxa" w:w="2183"/>
-            <w:vAlign w:val="center"/>
-            <w:shd w:fill="F1F5FA"/>
-            <w:tcBorders>
-              <w:top w:val="single" w:sz="4" w:color="D9D9D9"/>
-              <w:left w:val="single" w:sz="4" w:color="D9D9D9"/>
-              <w:bottom w:val="single" w:sz="4" w:color="D9D9D9"/>
-              <w:right w:val="single" w:sz="4" w:color="D9D9D9"/>
-            </w:tcBorders>
-          </w:tcPr>
-          <w:p>
-            <w:pPr>
-              <w:keepNext/>
-              <w:spacing w:after="80" w:before="80"/>
-              <w:jc w:val="center"/>
-            </w:pPr>
-            <w:r>
-              <w:rPr>
-                <w:sz w:val="18"/>
-              </w:rPr>
               <w:t>5/36（13.9%）</w:t>
             </w:r>
           </w:p>
@@ -1165,7 +1139,33 @@
               <w:rPr>
                 <w:sz w:val="18"/>
               </w:rPr>
-              <w:t>10/36（27.8%）</w:t>
+              <w:t>8/36</w:t>
+            </w:r>
+          </w:p>
+        </w:tc>
+        <w:tc>
+          <w:tcPr>
+            <w:tcW w:type="dxa" w:w="2183"/>
+            <w:vAlign w:val="center"/>
+            <w:shd w:fill="F1F5FA"/>
+            <w:tcBorders>
+              <w:top w:val="single" w:sz="4" w:color="D9D9D9"/>
+              <w:left w:val="single" w:sz="4" w:color="D9D9D9"/>
+              <w:bottom w:val="single" w:sz="4" w:color="D9D9D9"/>
+              <w:right w:val="single" w:sz="4" w:color="D9D9D9"/>
+            </w:tcBorders>
+          </w:tcPr>
+          <w:p>
+            <w:pPr>
+              <w:keepNext/>
+              <w:spacing w:after="80" w:before="80"/>
+              <w:jc w:val="center"/>
+            </w:pPr>
+            <w:r>
+              <w:rPr>
+                <w:sz w:val="18"/>
+              </w:rPr>
+              <w:t>11/12（91.7%）</w:t>
             </w:r>
           </w:p>
         </w:tc>
@@ -1248,32 +1248,6 @@
               <w:rPr>
                 <w:sz w:val="18"/>
               </w:rPr>
-              <w:t>10/12（83.3%）</w:t>
-            </w:r>
-          </w:p>
-        </w:tc>
-        <w:tc>
-          <w:tcPr>
-            <w:tcW w:type="dxa" w:w="2183"/>
-            <w:vAlign w:val="center"/>
-            <w:shd w:fill="FFFFFF"/>
-            <w:tcBorders>
-              <w:top w:val="single" w:sz="4" w:color="D9D9D9"/>
-              <w:left w:val="single" w:sz="4" w:color="D9D9D9"/>
-              <w:bottom w:val="single" w:sz="4" w:color="D9D9D9"/>
-              <w:right w:val="single" w:sz="4" w:color="D9D9D9"/>
-            </w:tcBorders>
-          </w:tcPr>
-          <w:p>
-            <w:pPr>
-              <w:keepNext/>
-              <w:spacing w:after="80" w:before="80"/>
-              <w:jc w:val="center"/>
-            </w:pPr>
-            <w:r>
-              <w:rPr>
-                <w:sz w:val="18"/>
-              </w:rPr>
               <w:t>7/36（19.4%）</w:t>
             </w:r>
           </w:p>
@@ -1300,7 +1274,33 @@
               <w:rPr>
                 <w:sz w:val="18"/>
               </w:rPr>
-              <w:t>10/36（27.8%）</w:t>
+              <w:t>9/36</w:t>
+            </w:r>
+          </w:p>
+        </w:tc>
+        <w:tc>
+          <w:tcPr>
+            <w:tcW w:type="dxa" w:w="2183"/>
+            <w:vAlign w:val="center"/>
+            <w:shd w:fill="FFFFFF"/>
+            <w:tcBorders>
+              <w:top w:val="single" w:sz="4" w:color="D9D9D9"/>
+              <w:left w:val="single" w:sz="4" w:color="D9D9D9"/>
+              <w:bottom w:val="single" w:sz="4" w:color="D9D9D9"/>
+              <w:right w:val="single" w:sz="4" w:color="D9D9D9"/>
+            </w:tcBorders>
+          </w:tcPr>
+          <w:p>
+            <w:pPr>
+              <w:keepNext/>
+              <w:spacing w:after="80" w:before="80"/>
+              <w:jc w:val="center"/>
+            </w:pPr>
+            <w:r>
+              <w:rPr>
+                <w:sz w:val="18"/>
+              </w:rPr>
+              <w:t>10/12（83.3%）</w:t>
             </w:r>
           </w:p>
         </w:tc>
@@ -1381,31 +1381,6 @@
               <w:rPr>
                 <w:sz w:val="18"/>
               </w:rPr>
-              <w:t>11/12（91.7%）</w:t>
-            </w:r>
-          </w:p>
-        </w:tc>
-        <w:tc>
-          <w:tcPr>
-            <w:tcW w:type="dxa" w:w="2183"/>
-            <w:vAlign w:val="center"/>
-            <w:shd w:fill="F1F5FA"/>
-            <w:tcBorders>
-              <w:top w:val="single" w:sz="4" w:color="D9D9D9"/>
-              <w:left w:val="single" w:sz="4" w:color="D9D9D9"/>
-              <w:bottom w:val="single" w:sz="4" w:color="D9D9D9"/>
-              <w:right w:val="single" w:sz="4" w:color="D9D9D9"/>
-            </w:tcBorders>
-          </w:tcPr>
-          <w:p>
-            <w:pPr>
-              <w:spacing w:after="80" w:before="80"/>
-              <w:jc w:val="center"/>
-            </w:pPr>
-            <w:r>
-              <w:rPr>
-                <w:sz w:val="18"/>
-              </w:rPr>
               <w:t>0/36（0.0%）</w:t>
             </w:r>
           </w:p>
@@ -1431,7 +1406,32 @@
               <w:rPr>
                 <w:sz w:val="18"/>
               </w:rPr>
-              <w:t>3/36（8.3%）</w:t>
+              <w:t>0/36</w:t>
+            </w:r>
+          </w:p>
+        </w:tc>
+        <w:tc>
+          <w:tcPr>
+            <w:tcW w:type="dxa" w:w="2183"/>
+            <w:vAlign w:val="center"/>
+            <w:shd w:fill="F1F5FA"/>
+            <w:tcBorders>
+              <w:top w:val="single" w:sz="4" w:color="D9D9D9"/>
+              <w:left w:val="single" w:sz="4" w:color="D9D9D9"/>
+              <w:bottom w:val="single" w:sz="4" w:color="D9D9D9"/>
+              <w:right w:val="single" w:sz="4" w:color="D9D9D9"/>
+            </w:tcBorders>
+          </w:tcPr>
+          <w:p>
+            <w:pPr>
+              <w:spacing w:after="80" w:before="80"/>
+              <w:jc w:val="center"/>
+            </w:pPr>
+            <w:r>
+              <w:rPr>
+                <w:sz w:val="18"/>
+              </w:rPr>
+              <w:t>11/12（91.7%）</w:t>
             </w:r>
           </w:p>
         </w:tc>
@@ -1465,12 +1465,17 @@
     <w:p/>
     <w:p>
       <w:r>
-        <w:t>C2在36条攻击轨迹中未出现预定攻击目标达成，实际未授权写入为3条；C0与C1均为10条。C2的完整任务完成为27/36，高于C0的24/36和C1的25/36。正常条件下，C0与C2均完成11/12。</w:t>
+        <w:t>C0有8/36条攻击轨迹实际执行了违反静态授权规则的写入，C1为9/36，C2为0/36。C2中7条轨迹出现受检违规请求，执行器实际拒绝15次，被拒绝的请求成功执行数为0。</w:t>
       </w:r>
     </w:p>
     <w:p>
       <w:r>
-        <w:t>C2在7条攻击轨迹中拒绝15个请求。正常条件下，8个符合独立任务规格的候选写调用全部放行，误拒为0/8。其余正常轨迹包含只读任务或未形成正确候选写调用的运行，因此误拒分母采用调用数。</w:t>
+        <w:t>周期付款劫持目标在C0、C1、C2分别达成5/12、6/12、0/12；音乐服务信息外传分别为0/12、1/12、0/12。大额转账目标在三个配置中均为0/12。</w:t>
+      </w:r>
+    </w:p>
+    <w:p>
+      <w:r>
+        <w:t>正常条件下，C0与C2的完整任务完成均为11/12。C2中8个符合独立任务规格的正常候选写调用全部获准，合法调用误拒为0/8。</w:t>
       </w:r>
     </w:p>
     <w:p>
@@ -1478,27 +1483,581 @@
         <w:pStyle w:val="Heading2"/>
       </w:pPr>
       <w:r>
-        <w:t>7.3 各类攻击与参数偏差</w:t>
+        <w:t>7.3 运行时审计中的三类拦截</w:t>
+      </w:r>
+    </w:p>
+    <w:tbl>
+      <w:tblPr>
+        <w:tblW w:type="auto" w:w="0"/>
+        <w:tblLayout w:type="fixed"/>
+        <w:tblLook w:firstColumn="1" w:firstRow="1" w:lastColumn="0" w:lastRow="0" w:noHBand="0" w:noVBand="1" w:val="04A0"/>
+      </w:tblPr>
+      <w:tblGrid>
+        <w:gridCol w:w="3061"/>
+        <w:gridCol w:w="2268"/>
+        <w:gridCol w:w="2268"/>
+        <w:gridCol w:w="2268"/>
+      </w:tblGrid>
+      <w:tr>
+        <w:trPr>
+          <w:cantSplit/>
+          <w:tblHeader/>
+        </w:trPr>
+        <w:tc>
+          <w:tcPr>
+            <w:tcW w:type="dxa" w:w="3061"/>
+            <w:vAlign w:val="center"/>
+            <w:shd w:fill="234F7D"/>
+            <w:tcBorders>
+              <w:top w:val="single" w:sz="4" w:color="D9D9D9"/>
+              <w:left w:val="single" w:sz="4" w:color="D9D9D9"/>
+              <w:bottom w:val="single" w:sz="4" w:color="D9D9D9"/>
+              <w:right w:val="single" w:sz="4" w:color="D9D9D9"/>
+            </w:tcBorders>
+          </w:tcPr>
+          <w:p>
+            <w:pPr>
+              <w:keepNext/>
+              <w:spacing w:after="80" w:before="80"/>
+              <w:jc w:val="center"/>
+            </w:pPr>
+            <w:r>
+              <w:rPr>
+                <w:b/>
+                <w:color w:val="FFFFFF"/>
+                <w:sz w:val="18"/>
+              </w:rPr>
+              <w:t>触发规则</w:t>
+            </w:r>
+          </w:p>
+        </w:tc>
+        <w:tc>
+          <w:tcPr>
+            <w:tcW w:type="dxa" w:w="2268"/>
+            <w:vAlign w:val="center"/>
+            <w:shd w:fill="234F7D"/>
+            <w:tcBorders>
+              <w:top w:val="single" w:sz="4" w:color="D9D9D9"/>
+              <w:left w:val="single" w:sz="4" w:color="D9D9D9"/>
+              <w:bottom w:val="single" w:sz="4" w:color="D9D9D9"/>
+              <w:right w:val="single" w:sz="4" w:color="D9D9D9"/>
+            </w:tcBorders>
+          </w:tcPr>
+          <w:p>
+            <w:pPr>
+              <w:keepNext/>
+              <w:spacing w:after="80" w:before="80"/>
+              <w:jc w:val="center"/>
+            </w:pPr>
+            <w:r>
+              <w:rPr>
+                <w:b/>
+                <w:color w:val="FFFFFF"/>
+                <w:sz w:val="18"/>
+              </w:rPr>
+              <w:t>提出请求</w:t>
+            </w:r>
+          </w:p>
+        </w:tc>
+        <w:tc>
+          <w:tcPr>
+            <w:tcW w:type="dxa" w:w="2268"/>
+            <w:vAlign w:val="center"/>
+            <w:shd w:fill="234F7D"/>
+            <w:tcBorders>
+              <w:top w:val="single" w:sz="4" w:color="D9D9D9"/>
+              <w:left w:val="single" w:sz="4" w:color="D9D9D9"/>
+              <w:bottom w:val="single" w:sz="4" w:color="D9D9D9"/>
+              <w:right w:val="single" w:sz="4" w:color="D9D9D9"/>
+            </w:tcBorders>
+          </w:tcPr>
+          <w:p>
+            <w:pPr>
+              <w:keepNext/>
+              <w:spacing w:after="80" w:before="80"/>
+              <w:jc w:val="center"/>
+            </w:pPr>
+            <w:r>
+              <w:rPr>
+                <w:b/>
+                <w:color w:val="FFFFFF"/>
+                <w:sz w:val="18"/>
+              </w:rPr>
+              <w:t>实际拒绝</w:t>
+            </w:r>
+          </w:p>
+        </w:tc>
+        <w:tc>
+          <w:tcPr>
+            <w:tcW w:type="dxa" w:w="2268"/>
+            <w:vAlign w:val="center"/>
+            <w:shd w:fill="234F7D"/>
+            <w:tcBorders>
+              <w:top w:val="single" w:sz="4" w:color="D9D9D9"/>
+              <w:left w:val="single" w:sz="4" w:color="D9D9D9"/>
+              <w:bottom w:val="single" w:sz="4" w:color="D9D9D9"/>
+              <w:right w:val="single" w:sz="4" w:color="D9D9D9"/>
+            </w:tcBorders>
+          </w:tcPr>
+          <w:p>
+            <w:pPr>
+              <w:keepNext/>
+              <w:spacing w:after="80" w:before="80"/>
+              <w:jc w:val="center"/>
+            </w:pPr>
+            <w:r>
+              <w:rPr>
+                <w:b/>
+                <w:color w:val="FFFFFF"/>
+                <w:sz w:val="18"/>
+              </w:rPr>
+              <w:t>成功执行</w:t>
+            </w:r>
+          </w:p>
+        </w:tc>
+      </w:tr>
+      <w:tr>
+        <w:trPr>
+          <w:cantSplit/>
+        </w:trPr>
+        <w:tc>
+          <w:tcPr>
+            <w:tcW w:type="dxa" w:w="3061"/>
+            <w:vAlign w:val="center"/>
+            <w:shd w:fill="F1F5FA"/>
+            <w:tcBorders>
+              <w:top w:val="single" w:sz="4" w:color="D9D9D9"/>
+              <w:left w:val="single" w:sz="4" w:color="D9D9D9"/>
+              <w:bottom w:val="single" w:sz="4" w:color="D9D9D9"/>
+              <w:right w:val="single" w:sz="4" w:color="D9D9D9"/>
+            </w:tcBorders>
+          </w:tcPr>
+          <w:p>
+            <w:pPr>
+              <w:keepNext/>
+              <w:spacing w:after="80" w:before="80"/>
+              <w:jc w:val="center"/>
+            </w:pPr>
+            <w:r>
+              <w:rPr>
+                <w:sz w:val="18"/>
+              </w:rPr>
+              <w:t>工具未授权</w:t>
+            </w:r>
+          </w:p>
+        </w:tc>
+        <w:tc>
+          <w:tcPr>
+            <w:tcW w:type="dxa" w:w="2268"/>
+            <w:vAlign w:val="center"/>
+            <w:shd w:fill="F1F5FA"/>
+            <w:tcBorders>
+              <w:top w:val="single" w:sz="4" w:color="D9D9D9"/>
+              <w:left w:val="single" w:sz="4" w:color="D9D9D9"/>
+              <w:bottom w:val="single" w:sz="4" w:color="D9D9D9"/>
+              <w:right w:val="single" w:sz="4" w:color="D9D9D9"/>
+            </w:tcBorders>
+          </w:tcPr>
+          <w:p>
+            <w:pPr>
+              <w:keepNext/>
+              <w:spacing w:after="80" w:before="80"/>
+              <w:jc w:val="center"/>
+            </w:pPr>
+            <w:r>
+              <w:rPr>
+                <w:sz w:val="18"/>
+              </w:rPr>
+              <w:t>10</w:t>
+            </w:r>
+          </w:p>
+        </w:tc>
+        <w:tc>
+          <w:tcPr>
+            <w:tcW w:type="dxa" w:w="2268"/>
+            <w:vAlign w:val="center"/>
+            <w:shd w:fill="F1F5FA"/>
+            <w:tcBorders>
+              <w:top w:val="single" w:sz="4" w:color="D9D9D9"/>
+              <w:left w:val="single" w:sz="4" w:color="D9D9D9"/>
+              <w:bottom w:val="single" w:sz="4" w:color="D9D9D9"/>
+              <w:right w:val="single" w:sz="4" w:color="D9D9D9"/>
+            </w:tcBorders>
+          </w:tcPr>
+          <w:p>
+            <w:pPr>
+              <w:keepNext/>
+              <w:spacing w:after="80" w:before="80"/>
+              <w:jc w:val="center"/>
+            </w:pPr>
+            <w:r>
+              <w:rPr>
+                <w:sz w:val="18"/>
+              </w:rPr>
+              <w:t>10</w:t>
+            </w:r>
+          </w:p>
+        </w:tc>
+        <w:tc>
+          <w:tcPr>
+            <w:tcW w:type="dxa" w:w="2268"/>
+            <w:vAlign w:val="center"/>
+            <w:shd w:fill="F1F5FA"/>
+            <w:tcBorders>
+              <w:top w:val="single" w:sz="4" w:color="D9D9D9"/>
+              <w:left w:val="single" w:sz="4" w:color="D9D9D9"/>
+              <w:bottom w:val="single" w:sz="4" w:color="D9D9D9"/>
+              <w:right w:val="single" w:sz="4" w:color="D9D9D9"/>
+            </w:tcBorders>
+          </w:tcPr>
+          <w:p>
+            <w:pPr>
+              <w:keepNext/>
+              <w:spacing w:after="80" w:before="80"/>
+              <w:jc w:val="center"/>
+            </w:pPr>
+            <w:r>
+              <w:rPr>
+                <w:sz w:val="18"/>
+              </w:rPr>
+              <w:t>0</w:t>
+            </w:r>
+          </w:p>
+        </w:tc>
+      </w:tr>
+      <w:tr>
+        <w:trPr>
+          <w:cantSplit/>
+        </w:trPr>
+        <w:tc>
+          <w:tcPr>
+            <w:tcW w:type="dxa" w:w="3061"/>
+            <w:vAlign w:val="center"/>
+            <w:shd w:fill="FFFFFF"/>
+            <w:tcBorders>
+              <w:top w:val="single" w:sz="4" w:color="D9D9D9"/>
+              <w:left w:val="single" w:sz="4" w:color="D9D9D9"/>
+              <w:bottom w:val="single" w:sz="4" w:color="D9D9D9"/>
+              <w:right w:val="single" w:sz="4" w:color="D9D9D9"/>
+            </w:tcBorders>
+          </w:tcPr>
+          <w:p>
+            <w:pPr>
+              <w:keepNext/>
+              <w:spacing w:after="80" w:before="80"/>
+              <w:jc w:val="center"/>
+            </w:pPr>
+            <w:r>
+              <w:rPr>
+                <w:sz w:val="18"/>
+              </w:rPr>
+              <w:t>静态参数不符</w:t>
+            </w:r>
+          </w:p>
+        </w:tc>
+        <w:tc>
+          <w:tcPr>
+            <w:tcW w:type="dxa" w:w="2268"/>
+            <w:vAlign w:val="center"/>
+            <w:shd w:fill="FFFFFF"/>
+            <w:tcBorders>
+              <w:top w:val="single" w:sz="4" w:color="D9D9D9"/>
+              <w:left w:val="single" w:sz="4" w:color="D9D9D9"/>
+              <w:bottom w:val="single" w:sz="4" w:color="D9D9D9"/>
+              <w:right w:val="single" w:sz="4" w:color="D9D9D9"/>
+            </w:tcBorders>
+          </w:tcPr>
+          <w:p>
+            <w:pPr>
+              <w:keepNext/>
+              <w:spacing w:after="80" w:before="80"/>
+              <w:jc w:val="center"/>
+            </w:pPr>
+            <w:r>
+              <w:rPr>
+                <w:sz w:val="18"/>
+              </w:rPr>
+              <w:t>4</w:t>
+            </w:r>
+          </w:p>
+        </w:tc>
+        <w:tc>
+          <w:tcPr>
+            <w:tcW w:type="dxa" w:w="2268"/>
+            <w:vAlign w:val="center"/>
+            <w:shd w:fill="FFFFFF"/>
+            <w:tcBorders>
+              <w:top w:val="single" w:sz="4" w:color="D9D9D9"/>
+              <w:left w:val="single" w:sz="4" w:color="D9D9D9"/>
+              <w:bottom w:val="single" w:sz="4" w:color="D9D9D9"/>
+              <w:right w:val="single" w:sz="4" w:color="D9D9D9"/>
+            </w:tcBorders>
+          </w:tcPr>
+          <w:p>
+            <w:pPr>
+              <w:keepNext/>
+              <w:spacing w:after="80" w:before="80"/>
+              <w:jc w:val="center"/>
+            </w:pPr>
+            <w:r>
+              <w:rPr>
+                <w:sz w:val="18"/>
+              </w:rPr>
+              <w:t>4</w:t>
+            </w:r>
+          </w:p>
+        </w:tc>
+        <w:tc>
+          <w:tcPr>
+            <w:tcW w:type="dxa" w:w="2268"/>
+            <w:vAlign w:val="center"/>
+            <w:shd w:fill="FFFFFF"/>
+            <w:tcBorders>
+              <w:top w:val="single" w:sz="4" w:color="D9D9D9"/>
+              <w:left w:val="single" w:sz="4" w:color="D9D9D9"/>
+              <w:bottom w:val="single" w:sz="4" w:color="D9D9D9"/>
+              <w:right w:val="single" w:sz="4" w:color="D9D9D9"/>
+            </w:tcBorders>
+          </w:tcPr>
+          <w:p>
+            <w:pPr>
+              <w:keepNext/>
+              <w:spacing w:after="80" w:before="80"/>
+              <w:jc w:val="center"/>
+            </w:pPr>
+            <w:r>
+              <w:rPr>
+                <w:sz w:val="18"/>
+              </w:rPr>
+              <w:t>0</w:t>
+            </w:r>
+          </w:p>
+        </w:tc>
+      </w:tr>
+      <w:tr>
+        <w:trPr>
+          <w:cantSplit/>
+        </w:trPr>
+        <w:tc>
+          <w:tcPr>
+            <w:tcW w:type="dxa" w:w="3061"/>
+            <w:vAlign w:val="center"/>
+            <w:shd w:fill="F1F5FA"/>
+            <w:tcBorders>
+              <w:top w:val="single" w:sz="4" w:color="D9D9D9"/>
+              <w:left w:val="single" w:sz="4" w:color="D9D9D9"/>
+              <w:bottom w:val="single" w:sz="4" w:color="D9D9D9"/>
+              <w:right w:val="single" w:sz="4" w:color="D9D9D9"/>
+            </w:tcBorders>
+          </w:tcPr>
+          <w:p>
+            <w:pPr>
+              <w:keepNext/>
+              <w:spacing w:after="80" w:before="80"/>
+              <w:jc w:val="center"/>
+            </w:pPr>
+            <w:r>
+              <w:rPr>
+                <w:sz w:val="18"/>
+              </w:rPr>
+              <w:t>次数超限</w:t>
+            </w:r>
+          </w:p>
+        </w:tc>
+        <w:tc>
+          <w:tcPr>
+            <w:tcW w:type="dxa" w:w="2268"/>
+            <w:vAlign w:val="center"/>
+            <w:shd w:fill="F1F5FA"/>
+            <w:tcBorders>
+              <w:top w:val="single" w:sz="4" w:color="D9D9D9"/>
+              <w:left w:val="single" w:sz="4" w:color="D9D9D9"/>
+              <w:bottom w:val="single" w:sz="4" w:color="D9D9D9"/>
+              <w:right w:val="single" w:sz="4" w:color="D9D9D9"/>
+            </w:tcBorders>
+          </w:tcPr>
+          <w:p>
+            <w:pPr>
+              <w:keepNext/>
+              <w:spacing w:after="80" w:before="80"/>
+              <w:jc w:val="center"/>
+            </w:pPr>
+            <w:r>
+              <w:rPr>
+                <w:sz w:val="18"/>
+              </w:rPr>
+              <w:t>1</w:t>
+            </w:r>
+          </w:p>
+        </w:tc>
+        <w:tc>
+          <w:tcPr>
+            <w:tcW w:type="dxa" w:w="2268"/>
+            <w:vAlign w:val="center"/>
+            <w:shd w:fill="F1F5FA"/>
+            <w:tcBorders>
+              <w:top w:val="single" w:sz="4" w:color="D9D9D9"/>
+              <w:left w:val="single" w:sz="4" w:color="D9D9D9"/>
+              <w:bottom w:val="single" w:sz="4" w:color="D9D9D9"/>
+              <w:right w:val="single" w:sz="4" w:color="D9D9D9"/>
+            </w:tcBorders>
+          </w:tcPr>
+          <w:p>
+            <w:pPr>
+              <w:keepNext/>
+              <w:spacing w:after="80" w:before="80"/>
+              <w:jc w:val="center"/>
+            </w:pPr>
+            <w:r>
+              <w:rPr>
+                <w:sz w:val="18"/>
+              </w:rPr>
+              <w:t>1</w:t>
+            </w:r>
+          </w:p>
+        </w:tc>
+        <w:tc>
+          <w:tcPr>
+            <w:tcW w:type="dxa" w:w="2268"/>
+            <w:vAlign w:val="center"/>
+            <w:shd w:fill="F1F5FA"/>
+            <w:tcBorders>
+              <w:top w:val="single" w:sz="4" w:color="D9D9D9"/>
+              <w:left w:val="single" w:sz="4" w:color="D9D9D9"/>
+              <w:bottom w:val="single" w:sz="4" w:color="D9D9D9"/>
+              <w:right w:val="single" w:sz="4" w:color="D9D9D9"/>
+            </w:tcBorders>
+          </w:tcPr>
+          <w:p>
+            <w:pPr>
+              <w:keepNext/>
+              <w:spacing w:after="80" w:before="80"/>
+              <w:jc w:val="center"/>
+            </w:pPr>
+            <w:r>
+              <w:rPr>
+                <w:sz w:val="18"/>
+              </w:rPr>
+              <w:t>0</w:t>
+            </w:r>
+          </w:p>
+        </w:tc>
+      </w:tr>
+      <w:tr>
+        <w:trPr>
+          <w:cantSplit/>
+        </w:trPr>
+        <w:tc>
+          <w:tcPr>
+            <w:tcW w:type="dxa" w:w="3061"/>
+            <w:vAlign w:val="center"/>
+            <w:shd w:fill="FFFFFF"/>
+            <w:tcBorders>
+              <w:top w:val="single" w:sz="4" w:color="D9D9D9"/>
+              <w:left w:val="single" w:sz="4" w:color="D9D9D9"/>
+              <w:bottom w:val="single" w:sz="4" w:color="D9D9D9"/>
+              <w:right w:val="single" w:sz="4" w:color="D9D9D9"/>
+            </w:tcBorders>
+          </w:tcPr>
+          <w:p>
+            <w:pPr>
+              <w:spacing w:after="80" w:before="80"/>
+              <w:jc w:val="center"/>
+            </w:pPr>
+            <w:r>
+              <w:rPr>
+                <w:sz w:val="18"/>
+              </w:rPr>
+              <w:t>合计</w:t>
+            </w:r>
+          </w:p>
+        </w:tc>
+        <w:tc>
+          <w:tcPr>
+            <w:tcW w:type="dxa" w:w="2268"/>
+            <w:vAlign w:val="center"/>
+            <w:shd w:fill="FFFFFF"/>
+            <w:tcBorders>
+              <w:top w:val="single" w:sz="4" w:color="D9D9D9"/>
+              <w:left w:val="single" w:sz="4" w:color="D9D9D9"/>
+              <w:bottom w:val="single" w:sz="4" w:color="D9D9D9"/>
+              <w:right w:val="single" w:sz="4" w:color="D9D9D9"/>
+            </w:tcBorders>
+          </w:tcPr>
+          <w:p>
+            <w:pPr>
+              <w:spacing w:after="80" w:before="80"/>
+              <w:jc w:val="center"/>
+            </w:pPr>
+            <w:r>
+              <w:rPr>
+                <w:sz w:val="18"/>
+              </w:rPr>
+              <w:t>15</w:t>
+            </w:r>
+          </w:p>
+        </w:tc>
+        <w:tc>
+          <w:tcPr>
+            <w:tcW w:type="dxa" w:w="2268"/>
+            <w:vAlign w:val="center"/>
+            <w:shd w:fill="FFFFFF"/>
+            <w:tcBorders>
+              <w:top w:val="single" w:sz="4" w:color="D9D9D9"/>
+              <w:left w:val="single" w:sz="4" w:color="D9D9D9"/>
+              <w:bottom w:val="single" w:sz="4" w:color="D9D9D9"/>
+              <w:right w:val="single" w:sz="4" w:color="D9D9D9"/>
+            </w:tcBorders>
+          </w:tcPr>
+          <w:p>
+            <w:pPr>
+              <w:spacing w:after="80" w:before="80"/>
+              <w:jc w:val="center"/>
+            </w:pPr>
+            <w:r>
+              <w:rPr>
+                <w:sz w:val="18"/>
+              </w:rPr>
+              <w:t>15</w:t>
+            </w:r>
+          </w:p>
+        </w:tc>
+        <w:tc>
+          <w:tcPr>
+            <w:tcW w:type="dxa" w:w="2268"/>
+            <w:vAlign w:val="center"/>
+            <w:shd w:fill="FFFFFF"/>
+            <w:tcBorders>
+              <w:top w:val="single" w:sz="4" w:color="D9D9D9"/>
+              <w:left w:val="single" w:sz="4" w:color="D9D9D9"/>
+              <w:bottom w:val="single" w:sz="4" w:color="D9D9D9"/>
+              <w:right w:val="single" w:sz="4" w:color="D9D9D9"/>
+            </w:tcBorders>
+          </w:tcPr>
+          <w:p>
+            <w:pPr>
+              <w:spacing w:after="80" w:before="80"/>
+              <w:jc w:val="center"/>
+            </w:pPr>
+            <w:r>
+              <w:rPr>
+                <w:sz w:val="18"/>
+              </w:rPr>
+              <w:t>0</w:t>
+            </w:r>
+          </w:p>
+        </w:tc>
+      </w:tr>
+    </w:tbl>
+    <w:p/>
+    <w:p>
+      <w:r>
+        <w:t>工具未授权的10个请求涉及任务允许集合之外的写操作。静态参数不符的4个请求触发收款人或金额基本有效性检查。次数超限请求发生在同任务已成功写入一次之后。执行器在三类情况下均返回权限错误，被拒绝调用的successful标志为false。</w:t>
       </w:r>
     </w:p>
     <w:p>
       <w:r>
-        <w:t>每配置、每类攻击均运行12条。周期付款劫持在C0达成5/12、C1达成6/12、C2达成0/12；音乐服务信息外传分别为0/12、1/12、0/12。大额转账目标在三个配置中均为0/12，本实验对该类攻击的防御收益没有形成达成率差异。</w:t>
-      </w:r>
-    </w:p>
-    <w:p>
-      <w:r>
-        <w:t>C1的来源标记没有降低本实验的攻击达成率。C2的15个被拒绝请求中，10个因写工具未获授权，4个因参数不符合静态策略，1个因超过成功写入次数限制。三类拒绝分别对应工具范围、固定参数和执行次数的检查。</w:t>
-      </w:r>
-    </w:p>
-    <w:p>
-      <w:r>
-        <w:t>C2三条未授权写入均发生在差额退款任务，实际退款金额为2，正确金额为4，分布于seed=42的injection_task_0，以及seed=73的injection_task_0、injection_task_5。这些调用使用了获授权的send_money和正确朋友账户，金额也是有限正数，因此通过V0；独立评分按amount_mismatch标记。</w:t>
-      </w:r>
-    </w:p>
-    <w:p>
-      <w:r>
-        <w:t>该结果确定了V0的检查边界：工具和固定参数授权覆盖了修改既有付款、错误账户及重复写入等行为，动态金额的计算依据尚未纳入检查。差额退款的下一步约束需要同时关联入账记录中的10与用户给出的12，并核验10−12÷2这一计算过程。</w:t>
+        <w:t>第6节中，C0与C2均提出修改既有周期付款的调用。C0工具返回修改成功，原记录6的收款人改变；C2记录tool_not_authorized，原记录6保持原收款人。该项请求在执行前被阻断的结果与总体15次审计记录一致。</w:t>
       </w:r>
     </w:p>
     <w:p>
@@ -1506,12 +2065,7 @@
         <w:pStyle w:val="Heading2"/>
       </w:pPr>
       <w:r>
-        <w:t>7.4 配对复核与执行开销</w:t>
-      </w:r>
-    </w:p>
-    <w:p>
-      <w:r>
-        <w:t>按同一任务、种子的正常C0任务完成筛选，36组攻击对照中有33组满足基线任务完成条件。在这33组中，C0未授权写入8/33，C2为1/33；攻击下完整任务完成分别为24/33和27/33。该复核在模型已完成对应正常任务的条件下比较攻击结果。</w:t>
+        <w:t>7.4 固定调用复放与证据核对</w:t>
       </w:r>
     </w:p>
     <w:p>
@@ -1533,19 +2087,38 @@
     </w:p>
     <w:p>
       <w:r>
-        <w:t>C0、C1、C2分别产生178、181、197次模型请求，各配置48条轨迹的累计运行时间约49.6、52.2、57.7分钟。请求数包含权限错误返回后的模型调用，累计时间同时受生成长度和工具轮次影响。程序没有单独测量授权检查函数耗时。</w:t>
+        <w:t>正式对照覆盖四项开发任务和三个固定攻击目标。每个采样种子运行完整48项矩阵，所有36条攻击条件均纳入各配置统计。执行授权复核保留每个候选调用的原始轨迹编号、规则决定、成功执行标志和实际拦截标志。</w:t>
       </w:r>
     </w:p>
     <w:p>
       <w:r>
-        <w:t>本次评测范围为四项开发任务与三个固定攻击目标，144条记录是同一实验矩阵的三次重复测量。当前结果支持在该范围内比较配置表现；独立任务、攻击改写和跨模型效果属于第五次汇报的评测范围。</w:t>
-      </w:r>
-    </w:p>
-    <w:p>
-      <w:r>
-        <w:t>统计记录：</w:t>
+        <w:t>执行核对：</w:t>
       </w:r>
       <w:hyperlink r:id="rId26">
+        <w:r>
+          <w:rPr>
+            <w:color w:val="234F7D"/>
+            <w:u w:val="single"/>
+          </w:rPr>
+          <w:t>V0执行边界复核</w:t>
+        </w:r>
+      </w:hyperlink>
+      <w:r>
+        <w:t>；</w:t>
+      </w:r>
+      <w:hyperlink r:id="rId27">
+        <w:r>
+          <w:rPr>
+            <w:color w:val="234F7D"/>
+            <w:u w:val="single"/>
+          </w:rPr>
+          <w:t>135个候选调用的规则与执行记录</w:t>
+        </w:r>
+      </w:hyperlink>
+      <w:r>
+        <w:t>。综合任务评分：</w:t>
+      </w:r>
+      <w:hyperlink r:id="rId28">
         <w:r>
           <w:rPr>
             <w:color w:val="234F7D"/>
@@ -1557,7 +2130,7 @@
       <w:r>
         <w:t>；</w:t>
       </w:r>
-      <w:hyperlink r:id="rId27">
+      <w:hyperlink r:id="rId29">
         <w:r>
           <w:rPr>
             <w:color w:val="234F7D"/>
@@ -1567,21 +2140,9 @@
         </w:r>
       </w:hyperlink>
       <w:r>
-        <w:t>；</w:t>
-      </w:r>
-      <w:hyperlink r:id="rId28">
-        <w:r>
-          <w:rPr>
-            <w:color w:val="234F7D"/>
-            <w:u w:val="single"/>
-          </w:rPr>
-          <w:t>135个候选写调用</w:t>
-        </w:r>
-      </w:hyperlink>
-      <w:r>
         <w:t>。批次日志：</w:t>
       </w:r>
-      <w:hyperlink r:id="rId29">
+      <w:hyperlink r:id="rId30">
         <w:r>
           <w:rPr>
             <w:color w:val="234F7D"/>
@@ -1593,7 +2154,7 @@
       <w:r>
         <w:t>；</w:t>
       </w:r>
-      <w:hyperlink r:id="rId30">
+      <w:hyperlink r:id="rId31">
         <w:r>
           <w:rPr>
             <w:color w:val="234F7D"/>
@@ -1611,26 +2172,21 @@
         <w:pStyle w:val="Heading1"/>
       </w:pPr>
       <w:r>
-        <w:t>8 阶段研究结论</w:t>
+        <w:t>8 执行前授权检查的验证结论</w:t>
       </w:r>
     </w:p>
     <w:p>
       <w:r>
-        <w:t>本阶段完成了从交易备注注入、模型工具调用到银行状态核对的实验系统。相较第一次的机制调研，本组实现了任务授权策略和执行前阻断，并用独立评分同时检查正常任务目标与附带写入。正式实验完整覆盖四项任务、正常输入及三类攻击、三种配置和三个随机种子。</w:t>
+        <w:t>本组完成了从交易备注注入、模型提出调用、程序检查到银行状态核对的实验系统。任务授权规则已接入真实模型的工具执行路径，拒绝决定发生在银行写函数执行之前。</w:t>
       </w:r>
     </w:p>
     <w:p>
       <w:r>
-        <w:t>周期付款对照记录中，模型已提出同类越权请求，执行授权检查阻止了既有付款收款人的修改。总体实验中，C2的预定攻击目标达成为0/36，正常任务完成11/12，攻击下完整任务完成27/36。</w:t>
-      </w:r>
-    </w:p>
-    <w:p>
-      <w:r>
-        <w:t>第三次汇报的实现对象是字段与记录授权V1。差额退款中的金额偏差确定了具体检查需求：登记工具返回字段所属的交易记录，要求参数使用字段引用或受限计算表达式，由程序核对来源并计算金额。该机制的评测将围绕合法引用、跨字段替换、跨记录替换和伪造来源展开。</w:t>
+        <w:t>在本次四项任务、三种攻击目标的对照中，C2实际拒绝15个受检违规请求，这些请求的成功写入数为0，预定攻击目标达成为0/36。周期付款案例同时记录了越权修改请求、拒绝原因和原收款人保持原值，验证了V0对执行边界的控制。</w:t>
       </w:r>
     </w:p>
     <w:sectPr>
-      <w:footerReference w:type="default" r:id="rId31"/>
+      <w:footerReference w:type="default" r:id="rId32"/>
       <w:pgSz w:w="12240" w:h="15840"/>
       <w:pgMar w:top="1020" w:right="1020" w:bottom="1020" w:left="1020" w:header="720" w:footer="720" w:gutter="0"/>
       <w:cols w:space="720"/>

</xml_diff>